<commit_message>
Office 模板换成新墨色 #38352F（OneHistory 统一配色 2026-10-23）
</commit_message>
<xml_diff>
--- a/z-Unused/b-Office/立项报告.docx
+++ b/z-Unused/b-Office/立项报告.docx
@@ -139,7 +139,7 @@
                                 </a:avLst>
                               </a:prstGeom>
                               <a:solidFill>
-                                <a:srgbClr val="26231E"/>
+                                <a:srgbClr val="38352F"/>
                               </a:solidFill>
                               <a:ln w="12700" cap="flat" cmpd="sng" algn="ctr">
                                 <a:noFill/>
@@ -191,7 +191,7 @@
                 </mc:Choice>
                 <mc:Fallback>
                   <w:pict>
-                    <v:roundrect w14:anchorId="4B5FEED6" id="OH_CoverBar" o:spid="_x0000_s1026" style="position:absolute;margin-left:0;margin-top:0;width:331.5pt;height:33.75pt;z-index:251659264;visibility:visible;mso-wrap-style:square;mso-wrap-distance-left:9pt;mso-wrap-distance-top:0;mso-wrap-distance-right:9pt;mso-wrap-distance-bottom:0;mso-position-horizontal:absolute;mso-position-horizontal-relative:text;mso-position-vertical:absolute;mso-position-vertical-relative:text;v-text-anchor:middle" arcsize="10680f" o:gfxdata="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" fillcolor="#26231e" stroked="f" strokecolor="#09101d [484]" strokeweight="1pt">
+                    <v:roundrect w14:anchorId="4B5FEED6" id="OH_CoverBar" o:spid="_x0000_s1026" style="position:absolute;margin-left:0;margin-top:0;width:331.5pt;height:33.75pt;z-index:251659264;visibility:visible;mso-wrap-style:square;mso-wrap-distance-left:9pt;mso-wrap-distance-top:0;mso-wrap-distance-right:9pt;mso-wrap-distance-bottom:0;mso-position-horizontal:absolute;mso-position-horizontal-relative:text;mso-position-vertical:absolute;mso-position-vertical-relative:text;v-text-anchor:middle" arcsize="10680f" o:gfxdata="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" fillcolor="#38352F" stroked="f" strokecolor="#09101d [484]" strokeweight="1pt">
                       <v:stroke joinstyle="miter"/>
                       <w10:anchorlock/>
                     </v:roundrect>
@@ -236,7 +236,7 @@
       </w:pPr>
       <w:r>
         <w:rPr>
-          <w:color w:val="6A6458"/>
+          <w:color w:val="38352F"/>
         </w:rPr>
         <w:t xml:space="preserve">编号　</w:t>
       </w:r>
@@ -251,9 +251,9 @@
       <w:tblPr>
         <w:tblW w:w="9072" w:type="dxa"/>
         <w:tblBorders>
-          <w:top w:val="single" w:sz="18" w:space="0" w:color="26231E"/>
+          <w:top w:val="single" w:sz="18" w:space="0" w:color="38352F"/>
           <w:left w:val="nil"/>
-          <w:bottom w:val="single" w:sz="8" w:space="0" w:color="26231E"/>
+          <w:bottom w:val="single" w:sz="8" w:space="0" w:color="38352F"/>
           <w:right w:val="nil"/>
           <w:insideH w:val="single" w:sz="4" w:space="0" w:color="D5D1C8"/>
           <w:insideV w:val="single" w:sz="4" w:space="0" w:color="D5D1C8"/>
@@ -288,7 +288,7 @@
             </w:pPr>
             <w:r>
               <w:rPr>
-                <w:color w:val="6A6458"/>
+                <w:color w:val="38352F"/>
                 <w:sz w:val="16"/>
                 <w:szCs w:val="16"/>
               </w:rPr>
@@ -326,7 +326,7 @@
             </w:pPr>
             <w:r>
               <w:rPr>
-                <w:color w:val="6A6458"/>
+                <w:color w:val="38352F"/>
                 <w:sz w:val="16"/>
                 <w:szCs w:val="16"/>
               </w:rPr>
@@ -364,7 +364,7 @@
             </w:pPr>
             <w:r>
               <w:rPr>
-                <w:color w:val="6A6458"/>
+                <w:color w:val="38352F"/>
                 <w:sz w:val="16"/>
                 <w:szCs w:val="16"/>
               </w:rPr>
@@ -402,7 +402,7 @@
             </w:pPr>
             <w:r>
               <w:rPr>
-                <w:color w:val="6A6458"/>
+                <w:color w:val="38352F"/>
                 <w:sz w:val="16"/>
                 <w:szCs w:val="16"/>
               </w:rPr>
@@ -415,7 +415,7 @@
             </w:pPr>
             <w:r>
               <w:rPr>
-                <w:color w:val="6A6458"/>
+                <w:color w:val="38352F"/>
                 <w:sz w:val="20"/>
                 <w:szCs w:val="20"/>
               </w:rPr>
@@ -441,7 +441,7 @@
             </w:pPr>
             <w:r>
               <w:rPr>
-                <w:color w:val="6A6458"/>
+                <w:color w:val="38352F"/>
                 <w:sz w:val="16"/>
                 <w:szCs w:val="16"/>
               </w:rPr>
@@ -479,7 +479,7 @@
             </w:pPr>
             <w:r>
               <w:rPr>
-                <w:color w:val="6A6458"/>
+                <w:color w:val="38352F"/>
                 <w:sz w:val="16"/>
                 <w:szCs w:val="16"/>
               </w:rPr>
@@ -492,7 +492,7 @@
             </w:pPr>
             <w:r>
               <w:rPr>
-                <w:color w:val="6A6458"/>
+                <w:color w:val="38352F"/>
                 <w:sz w:val="20"/>
                 <w:szCs w:val="20"/>
               </w:rPr>
@@ -500,7 +500,7 @@
             </w:r>
             <w:r>
               <w:rPr>
-                <w:color w:val="6A6458"/>
+                <w:color w:val="38352F"/>
                 <w:sz w:val="20"/>
                 <w:szCs w:val="20"/>
               </w:rPr>
@@ -508,7 +508,7 @@
             </w:r>
             <w:r>
               <w:rPr>
-                <w:color w:val="6A6458"/>
+                <w:color w:val="38352F"/>
                 <w:sz w:val="20"/>
                 <w:szCs w:val="20"/>
               </w:rPr>
@@ -533,7 +533,7 @@
             </w:pPr>
             <w:r>
               <w:rPr>
-                <w:color w:val="6A6458"/>
+                <w:color w:val="38352F"/>
                 <w:sz w:val="16"/>
                 <w:szCs w:val="16"/>
               </w:rPr>
@@ -612,7 +612,7 @@
                           </a:avLst>
                         </a:prstGeom>
                         <a:solidFill>
-                          <a:srgbClr val="26231E"/>
+                          <a:srgbClr val="38352F"/>
                         </a:solidFill>
                         <a:ln w="12700" cap="flat" cmpd="sng" algn="ctr">
                           <a:noFill/>
@@ -687,7 +687,7 @@
           </mc:Choice>
           <mc:Fallback>
             <w:pict>
-              <v:roundrect w14:anchorId="16D7E415" id="矩形: 圆角 3" o:spid="_x0000_s1026" alt="OH_InkBar" style="width:286.15pt;height:16.1pt;visibility:visible;mso-wrap-style:square;mso-left-percent:-10001;mso-top-percent:-10001;mso-position-horizontal:absolute;mso-position-horizontal-relative:char;mso-position-vertical:absolute;mso-position-vertical-relative:line;mso-left-percent:-10001;mso-top-percent:-10001;v-text-anchor:middle" arcsize="22388f" o:gfxdata="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" fillcolor="#26231e" stroked="f" strokecolor="#09101d [484]" strokeweight="1pt">
+              <v:roundrect w14:anchorId="16D7E415" id="矩形: 圆角 3" o:spid="_x0000_s1026" alt="OH_InkBar" style="width:286.15pt;height:16.1pt;visibility:visible;mso-wrap-style:square;mso-left-percent:-10001;mso-top-percent:-10001;mso-position-horizontal:absolute;mso-position-horizontal-relative:char;mso-position-vertical:absolute;mso-position-vertical-relative:line;mso-left-percent:-10001;mso-top-percent:-10001;v-text-anchor:middle" arcsize="22388f" o:gfxdata="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" fillcolor="#38352F" stroked="f" strokecolor="#09101d [484]" strokeweight="1pt">
                 <v:stroke joinstyle="miter"/>
                 <v:textbox inset="8pt,0,10pt,0">
                   <w:txbxContent>
@@ -791,7 +791,7 @@
                           </a:avLst>
                         </a:prstGeom>
                         <a:solidFill>
-                          <a:srgbClr val="26231E"/>
+                          <a:srgbClr val="38352F"/>
                         </a:solidFill>
                         <a:ln w="12700" cap="flat" cmpd="sng" algn="ctr">
                           <a:noFill/>
@@ -843,7 +843,7 @@
           </mc:Choice>
           <mc:Fallback>
             <w:pict>
-              <v:roundrect w14:anchorId="4F4F0294" id="矩形: 圆角 4" o:spid="_x0000_s1026" alt="OH_InkBar" style="width:363.8pt;height:16.1pt;visibility:visible;mso-wrap-style:square;mso-left-percent:-10001;mso-top-percent:-10001;mso-position-horizontal:absolute;mso-position-horizontal-relative:char;mso-position-vertical:absolute;mso-position-vertical-relative:line;mso-left-percent:-10001;mso-top-percent:-10001;v-text-anchor:middle" arcsize="22388f" o:gfxdata="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" fillcolor="#26231e" stroked="f" strokecolor="#09101d [484]" strokeweight="1pt">
+              <v:roundrect w14:anchorId="4F4F0294" id="矩形: 圆角 4" o:spid="_x0000_s1026" alt="OH_InkBar" style="width:363.8pt;height:16.1pt;visibility:visible;mso-wrap-style:square;mso-left-percent:-10001;mso-top-percent:-10001;mso-position-horizontal:absolute;mso-position-horizontal-relative:char;mso-position-vertical:absolute;mso-position-vertical-relative:line;mso-left-percent:-10001;mso-top-percent:-10001;v-text-anchor:middle" arcsize="22388f" o:gfxdata="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" fillcolor="#38352F" stroked="f" strokecolor="#09101d [484]" strokeweight="1pt">
                 <v:stroke joinstyle="miter"/>
                 <w10:anchorlock/>
               </v:roundrect>
@@ -1019,7 +1019,7 @@
                           </a:avLst>
                         </a:prstGeom>
                         <a:solidFill>
-                          <a:srgbClr val="26231E"/>
+                          <a:srgbClr val="38352F"/>
                         </a:solidFill>
                         <a:ln w="12700" cap="flat" cmpd="sng" algn="ctr">
                           <a:noFill/>
@@ -1071,7 +1071,7 @@
           </mc:Choice>
           <mc:Fallback>
             <w:pict>
-              <v:roundrect w14:anchorId="0B57B536" id="矩形: 圆角 5" o:spid="_x0000_s1026" alt="OH_InkBar" style="width:273pt;height:16.1pt;visibility:visible;mso-wrap-style:square;mso-left-percent:-10001;mso-top-percent:-10001;mso-position-horizontal:absolute;mso-position-horizontal-relative:char;mso-position-vertical:absolute;mso-position-vertical-relative:line;mso-left-percent:-10001;mso-top-percent:-10001;v-text-anchor:middle" arcsize="22388f" o:gfxdata="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" fillcolor="#26231e" stroked="f" strokecolor="#09101d [484]" strokeweight="1pt">
+              <v:roundrect w14:anchorId="0B57B536" id="矩形: 圆角 5" o:spid="_x0000_s1026" alt="OH_InkBar" style="width:273pt;height:16.1pt;visibility:visible;mso-wrap-style:square;mso-left-percent:-10001;mso-top-percent:-10001;mso-position-horizontal:absolute;mso-position-horizontal-relative:char;mso-position-vertical:absolute;mso-position-vertical-relative:line;mso-left-percent:-10001;mso-top-percent:-10001;v-text-anchor:middle" arcsize="22388f" o:gfxdata="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" fillcolor="#38352F" stroked="f" strokecolor="#09101d [484]" strokeweight="1pt">
                 <v:stroke joinstyle="miter"/>
                 <w10:anchorlock/>
               </v:roundrect>
@@ -1153,7 +1153,7 @@
                           </a:avLst>
                         </a:prstGeom>
                         <a:solidFill>
-                          <a:srgbClr val="26231E"/>
+                          <a:srgbClr val="38352F"/>
                         </a:solidFill>
                         <a:ln w="12700" cap="flat" cmpd="sng" algn="ctr">
                           <a:noFill/>
@@ -1228,7 +1228,7 @@
           </mc:Choice>
           <mc:Fallback>
             <w:pict>
-              <v:roundrect w14:anchorId="5623FA2D" id="矩形: 圆角 6" o:spid="_x0000_s1027" alt="OH_InkBar" style="width:338.15pt;height:16.1pt;visibility:visible;mso-wrap-style:square;mso-left-percent:-10001;mso-top-percent:-10001;mso-position-horizontal:absolute;mso-position-horizontal-relative:char;mso-position-vertical:absolute;mso-position-vertical-relative:line;mso-left-percent:-10001;mso-top-percent:-10001;v-text-anchor:middle" arcsize="22388f" o:gfxdata="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" fillcolor="#26231e" stroked="f" strokecolor="#09101d [484]" strokeweight="1pt">
+              <v:roundrect w14:anchorId="5623FA2D" id="矩形: 圆角 6" o:spid="_x0000_s1027" alt="OH_InkBar" style="width:338.15pt;height:16.1pt;visibility:visible;mso-wrap-style:square;mso-left-percent:-10001;mso-top-percent:-10001;mso-position-horizontal:absolute;mso-position-horizontal-relative:char;mso-position-vertical:absolute;mso-position-vertical-relative:line;mso-left-percent:-10001;mso-top-percent:-10001;v-text-anchor:middle" arcsize="22388f" o:gfxdata="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" fillcolor="#38352F" stroked="f" strokecolor="#09101d [484]" strokeweight="1pt">
                 <v:stroke joinstyle="miter"/>
                 <v:textbox inset="8pt,0,10pt,0">
                   <w:txbxContent>
@@ -1338,7 +1338,7 @@
                           </a:avLst>
                         </a:prstGeom>
                         <a:solidFill>
-                          <a:srgbClr val="26231E"/>
+                          <a:srgbClr val="38352F"/>
                         </a:solidFill>
                         <a:ln w="12700" cap="flat" cmpd="sng" algn="ctr">
                           <a:noFill/>
@@ -1390,7 +1390,7 @@
           </mc:Choice>
           <mc:Fallback>
             <w:pict>
-              <v:roundrect w14:anchorId="496CA11E" id="矩形: 圆角 7" o:spid="_x0000_s1026" alt="OH_InkBar" style="width:363.8pt;height:16.1pt;visibility:visible;mso-wrap-style:square;mso-left-percent:-10001;mso-top-percent:-10001;mso-position-horizontal:absolute;mso-position-horizontal-relative:char;mso-position-vertical:absolute;mso-position-vertical-relative:line;mso-left-percent:-10001;mso-top-percent:-10001;v-text-anchor:middle" arcsize="22388f" o:gfxdata="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" fillcolor="#26231e" stroked="f" strokecolor="#09101d [484]" strokeweight="1pt">
+              <v:roundrect w14:anchorId="496CA11E" id="矩形: 圆角 7" o:spid="_x0000_s1026" alt="OH_InkBar" style="width:363.8pt;height:16.1pt;visibility:visible;mso-wrap-style:square;mso-left-percent:-10001;mso-top-percent:-10001;mso-position-horizontal:absolute;mso-position-horizontal-relative:char;mso-position-vertical:absolute;mso-position-vertical-relative:line;mso-left-percent:-10001;mso-top-percent:-10001;v-text-anchor:middle" arcsize="22388f" o:gfxdata="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" fillcolor="#38352F" stroked="f" strokecolor="#09101d [484]" strokeweight="1pt">
                 <v:stroke joinstyle="miter"/>
                 <w10:anchorlock/>
               </v:roundrect>
@@ -1405,13 +1405,13 @@
       </w:pPr>
       <w:r>
         <w:rPr>
-          <w:color w:val="6A6458"/>
+          <w:color w:val="38352F"/>
         </w:rPr>
         <w:t>PM</w:t>
       </w:r>
       <w:r>
         <w:rPr>
-          <w:color w:val="6A6458"/>
+          <w:color w:val="38352F"/>
         </w:rPr>
         <w:t xml:space="preserve">　</w:t>
       </w:r>
@@ -1420,7 +1420,7 @@
       </w:r>
       <w:r>
         <w:rPr>
-          <w:color w:val="6A6458"/>
+          <w:color w:val="38352F"/>
         </w:rPr>
         <w:t xml:space="preserve">　　　技术负责人　</w:t>
       </w:r>
@@ -1465,9 +1465,9 @@
             <w:tcW w:w="9072" w:type="dxa"/>
             <w:gridSpan w:val="8"/>
             <w:tcBorders>
-              <w:top w:val="single" w:sz="18" w:space="0" w:color="26231E"/>
-              <w:left w:val="nil"/>
-              <w:bottom w:val="single" w:sz="4" w:space="0" w:color="26231E"/>
+              <w:top w:val="single" w:sz="18" w:space="0" w:color="38352F"/>
+              <w:left w:val="nil"/>
+              <w:bottom w:val="single" w:sz="4" w:space="0" w:color="38352F"/>
               <w:right w:val="nil"/>
             </w:tcBorders>
             <w:tcMar>
@@ -1498,7 +1498,7 @@
             </w:r>
             <w:r>
               <w:rPr>
-                <w:color w:val="6A6458"/>
+                <w:color w:val="38352F"/>
               </w:rPr>
               <w:t>〔姓名〕</w:t>
             </w:r>
@@ -1765,7 +1765,7 @@
             <w:tcBorders>
               <w:top w:val="nil"/>
               <w:left w:val="nil"/>
-              <w:bottom w:val="single" w:sz="4" w:space="0" w:color="26231E"/>
+              <w:bottom w:val="single" w:sz="4" w:space="0" w:color="38352F"/>
               <w:right w:val="nil"/>
             </w:tcBorders>
             <w:tcMar>
@@ -1784,7 +1784,7 @@
             </w:r>
             <w:r>
               <w:rPr>
-                <w:color w:val="6A6458"/>
+                <w:color w:val="38352F"/>
               </w:rPr>
               <w:t>〔姓名〕</w:t>
             </w:r>
@@ -1804,7 +1804,7 @@
             </w:r>
             <w:r>
               <w:rPr>
-                <w:color w:val="6A6458"/>
+                <w:color w:val="38352F"/>
               </w:rPr>
               <w:t>〔姓名〕</w:t>
             </w:r>
@@ -1818,7 +1818,7 @@
             </w:r>
             <w:r>
               <w:rPr>
-                <w:color w:val="6A6458"/>
+                <w:color w:val="38352F"/>
               </w:rPr>
               <w:t>〔姓名〕</w:t>
             </w:r>
@@ -1830,7 +1830,7 @@
             <w:tcBorders>
               <w:top w:val="nil"/>
               <w:left w:val="single" w:sz="4" w:space="0" w:color="D5D1C8"/>
-              <w:bottom w:val="single" w:sz="4" w:space="0" w:color="26231E"/>
+              <w:bottom w:val="single" w:sz="4" w:space="0" w:color="38352F"/>
               <w:right w:val="nil"/>
             </w:tcBorders>
             <w:tcMar>
@@ -1846,7 +1846,7 @@
             </w:pPr>
             <w:r>
               <w:rPr>
-                <w:color w:val="6A6458"/>
+                <w:color w:val="38352F"/>
               </w:rPr>
               <w:t>〔姓名〕</w:t>
             </w:r>
@@ -1858,7 +1858,7 @@
             <w:tcBorders>
               <w:top w:val="nil"/>
               <w:left w:val="single" w:sz="4" w:space="0" w:color="D5D1C8"/>
-              <w:bottom w:val="single" w:sz="4" w:space="0" w:color="26231E"/>
+              <w:bottom w:val="single" w:sz="4" w:space="0" w:color="38352F"/>
               <w:right w:val="nil"/>
             </w:tcBorders>
             <w:tcMar>
@@ -1874,7 +1874,7 @@
             </w:pPr>
             <w:r>
               <w:rPr>
-                <w:color w:val="6A6458"/>
+                <w:color w:val="38352F"/>
               </w:rPr>
               <w:t>〔姓名〕</w:t>
             </w:r>
@@ -1886,7 +1886,7 @@
             <w:tcBorders>
               <w:top w:val="nil"/>
               <w:left w:val="single" w:sz="4" w:space="0" w:color="D5D1C8"/>
-              <w:bottom w:val="single" w:sz="4" w:space="0" w:color="26231E"/>
+              <w:bottom w:val="single" w:sz="4" w:space="0" w:color="38352F"/>
               <w:right w:val="nil"/>
             </w:tcBorders>
             <w:tcMar>
@@ -1902,7 +1902,7 @@
             </w:pPr>
             <w:r>
               <w:rPr>
-                <w:color w:val="6A6458"/>
+                <w:color w:val="38352F"/>
               </w:rPr>
               <w:t>〔姓名〕</w:t>
             </w:r>
@@ -1914,7 +1914,7 @@
             <w:tcBorders>
               <w:top w:val="nil"/>
               <w:left w:val="single" w:sz="4" w:space="0" w:color="D5D1C8"/>
-              <w:bottom w:val="single" w:sz="4" w:space="0" w:color="26231E"/>
+              <w:bottom w:val="single" w:sz="4" w:space="0" w:color="38352F"/>
               <w:right w:val="nil"/>
             </w:tcBorders>
             <w:tcMar>
@@ -1930,7 +1930,7 @@
             </w:pPr>
             <w:r>
               <w:rPr>
-                <w:color w:val="6A6458"/>
+                <w:color w:val="38352F"/>
               </w:rPr>
               <w:t>〔姓名〕</w:t>
             </w:r>
@@ -1942,7 +1942,7 @@
             <w:tcBorders>
               <w:top w:val="nil"/>
               <w:left w:val="single" w:sz="4" w:space="0" w:color="D5D1C8"/>
-              <w:bottom w:val="single" w:sz="4" w:space="0" w:color="26231E"/>
+              <w:bottom w:val="single" w:sz="4" w:space="0" w:color="38352F"/>
               <w:right w:val="nil"/>
             </w:tcBorders>
             <w:tcMar>
@@ -1958,7 +1958,7 @@
             </w:pPr>
             <w:r>
               <w:rPr>
-                <w:color w:val="6A6458"/>
+                <w:color w:val="38352F"/>
               </w:rPr>
               <w:t>〔姓名〕</w:t>
             </w:r>
@@ -1970,7 +1970,7 @@
             <w:tcBorders>
               <w:top w:val="nil"/>
               <w:left w:val="single" w:sz="4" w:space="0" w:color="D5D1C8"/>
-              <w:bottom w:val="single" w:sz="4" w:space="0" w:color="26231E"/>
+              <w:bottom w:val="single" w:sz="4" w:space="0" w:color="38352F"/>
               <w:right w:val="nil"/>
             </w:tcBorders>
             <w:tcMar>
@@ -1986,7 +1986,7 @@
             </w:pPr>
             <w:r>
               <w:rPr>
-                <w:color w:val="6A6458"/>
+                <w:color w:val="38352F"/>
               </w:rPr>
               <w:t>〔姓名〕</w:t>
             </w:r>
@@ -1998,7 +1998,7 @@
             <w:tcBorders>
               <w:top w:val="nil"/>
               <w:left w:val="single" w:sz="4" w:space="0" w:color="D5D1C8"/>
-              <w:bottom w:val="single" w:sz="4" w:space="0" w:color="26231E"/>
+              <w:bottom w:val="single" w:sz="4" w:space="0" w:color="38352F"/>
               <w:right w:val="nil"/>
             </w:tcBorders>
             <w:tcMar>
@@ -2014,7 +2014,7 @@
             </w:pPr>
             <w:r>
               <w:rPr>
-                <w:color w:val="6A6458"/>
+                <w:color w:val="38352F"/>
               </w:rPr>
               <w:t>〔姓名〕</w:t>
             </w:r>
@@ -2028,7 +2028,7 @@
       </w:pPr>
       <w:r>
         <w:rPr>
-          <w:color w:val="6A6458"/>
+          <w:color w:val="38352F"/>
         </w:rPr>
         <w:t xml:space="preserve">项目组成员签字　</w:t>
       </w:r>
@@ -2091,7 +2091,7 @@
                           </a:avLst>
                         </a:prstGeom>
                         <a:solidFill>
-                          <a:srgbClr val="26231E"/>
+                          <a:srgbClr val="38352F"/>
                         </a:solidFill>
                         <a:ln w="12700" cap="flat" cmpd="sng" algn="ctr">
                           <a:noFill/>
@@ -2166,7 +2166,7 @@
           </mc:Choice>
           <mc:Fallback>
             <w:pict>
-              <v:roundrect w14:anchorId="4ABC1125" id="矩形: 圆角 8" o:spid="_x0000_s1028" alt="OH_InkBar" style="width:363.8pt;height:16.1pt;visibility:visible;mso-wrap-style:square;mso-left-percent:-10001;mso-top-percent:-10001;mso-position-horizontal:absolute;mso-position-horizontal-relative:char;mso-position-vertical:absolute;mso-position-vertical-relative:line;mso-left-percent:-10001;mso-top-percent:-10001;v-text-anchor:middle" arcsize="22388f" o:gfxdata="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" fillcolor="#26231e" stroked="f" strokecolor="#09101d [484]" strokeweight="1pt">
+              <v:roundrect w14:anchorId="4ABC1125" id="矩形: 圆角 8" o:spid="_x0000_s1028" alt="OH_InkBar" style="width:363.8pt;height:16.1pt;visibility:visible;mso-wrap-style:square;mso-left-percent:-10001;mso-top-percent:-10001;mso-position-horizontal:absolute;mso-position-horizontal-relative:char;mso-position-vertical:absolute;mso-position-vertical-relative:line;mso-left-percent:-10001;mso-top-percent:-10001;v-text-anchor:middle" arcsize="22388f" o:gfxdata="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" fillcolor="#38352F" stroked="f" strokecolor="#09101d [484]" strokeweight="1pt">
                 <v:stroke joinstyle="miter"/>
                 <v:textbox inset="8pt,0,10pt,0">
                   <w:txbxContent>
@@ -2231,9 +2231,9 @@
           <w:tcPr>
             <w:tcW w:w="2300" w:type="dxa"/>
             <w:tcBorders>
-              <w:top w:val="single" w:sz="18" w:space="0" w:color="26231E"/>
-              <w:left w:val="nil"/>
-              <w:bottom w:val="single" w:sz="4" w:space="0" w:color="26231E"/>
+              <w:top w:val="single" w:sz="18" w:space="0" w:color="38352F"/>
+              <w:left w:val="nil"/>
+              <w:bottom w:val="single" w:sz="4" w:space="0" w:color="38352F"/>
               <w:right w:val="nil"/>
             </w:tcBorders>
             <w:tcMar>
@@ -2258,9 +2258,9 @@
           <w:tcPr>
             <w:tcW w:w="2172" w:type="dxa"/>
             <w:tcBorders>
-              <w:top w:val="single" w:sz="18" w:space="0" w:color="26231E"/>
-              <w:left w:val="nil"/>
-              <w:bottom w:val="single" w:sz="4" w:space="0" w:color="26231E"/>
+              <w:top w:val="single" w:sz="18" w:space="0" w:color="38352F"/>
+              <w:left w:val="nil"/>
+              <w:bottom w:val="single" w:sz="4" w:space="0" w:color="38352F"/>
               <w:right w:val="nil"/>
             </w:tcBorders>
             <w:tcMar>
@@ -2285,9 +2285,9 @@
           <w:tcPr>
             <w:tcW w:w="1500" w:type="dxa"/>
             <w:tcBorders>
-              <w:top w:val="single" w:sz="18" w:space="0" w:color="26231E"/>
-              <w:left w:val="nil"/>
-              <w:bottom w:val="single" w:sz="4" w:space="0" w:color="26231E"/>
+              <w:top w:val="single" w:sz="18" w:space="0" w:color="38352F"/>
+              <w:left w:val="nil"/>
+              <w:bottom w:val="single" w:sz="4" w:space="0" w:color="38352F"/>
               <w:right w:val="nil"/>
             </w:tcBorders>
             <w:tcMar>
@@ -2312,9 +2312,9 @@
           <w:tcPr>
             <w:tcW w:w="1800" w:type="dxa"/>
             <w:tcBorders>
-              <w:top w:val="single" w:sz="18" w:space="0" w:color="26231E"/>
-              <w:left w:val="nil"/>
-              <w:bottom w:val="single" w:sz="4" w:space="0" w:color="26231E"/>
+              <w:top w:val="single" w:sz="18" w:space="0" w:color="38352F"/>
+              <w:left w:val="nil"/>
+              <w:bottom w:val="single" w:sz="4" w:space="0" w:color="38352F"/>
               <w:right w:val="nil"/>
             </w:tcBorders>
             <w:tcMar>
@@ -2339,9 +2339,9 @@
           <w:tcPr>
             <w:tcW w:w="1300" w:type="dxa"/>
             <w:tcBorders>
-              <w:top w:val="single" w:sz="18" w:space="0" w:color="26231E"/>
-              <w:left w:val="nil"/>
-              <w:bottom w:val="single" w:sz="4" w:space="0" w:color="26231E"/>
+              <w:top w:val="single" w:sz="18" w:space="0" w:color="38352F"/>
+              <w:left w:val="nil"/>
+              <w:bottom w:val="single" w:sz="4" w:space="0" w:color="38352F"/>
               <w:right w:val="nil"/>
             </w:tcBorders>
             <w:tcMar>
@@ -2421,7 +2421,7 @@
             </w:pPr>
             <w:r>
               <w:rPr>
-                <w:color w:val="6A6458"/>
+                <w:color w:val="38352F"/>
               </w:rPr>
               <w:t>〔立项报告〕</w:t>
             </w:r>
@@ -2451,7 +2451,7 @@
             </w:pPr>
             <w:r>
               <w:rPr>
-                <w:color w:val="6A6458"/>
+                <w:color w:val="38352F"/>
               </w:rPr>
               <w:t>〔姓名〕</w:t>
             </w:r>
@@ -2481,19 +2481,19 @@
             </w:pPr>
             <w:r>
               <w:rPr>
-                <w:color w:val="6A6458"/>
+                <w:color w:val="38352F"/>
               </w:rPr>
               <w:t>〔</w:t>
             </w:r>
             <w:r>
               <w:rPr>
-                <w:color w:val="6A6458"/>
+                <w:color w:val="38352F"/>
               </w:rPr>
               <w:t>YYYY-MM-DD</w:t>
             </w:r>
             <w:r>
               <w:rPr>
-                <w:color w:val="6A6458"/>
+                <w:color w:val="38352F"/>
               </w:rPr>
               <w:t>〕</w:t>
             </w:r>
@@ -2582,7 +2582,7 @@
             </w:pPr>
             <w:r>
               <w:rPr>
-                <w:color w:val="6A6458"/>
+                <w:color w:val="38352F"/>
               </w:rPr>
               <w:t>〔设计方案〕</w:t>
             </w:r>
@@ -2612,7 +2612,7 @@
             </w:pPr>
             <w:r>
               <w:rPr>
-                <w:color w:val="6A6458"/>
+                <w:color w:val="38352F"/>
               </w:rPr>
               <w:t>〔姓名〕</w:t>
             </w:r>
@@ -2642,19 +2642,19 @@
             </w:pPr>
             <w:r>
               <w:rPr>
-                <w:color w:val="6A6458"/>
+                <w:color w:val="38352F"/>
               </w:rPr>
               <w:t>〔</w:t>
             </w:r>
             <w:r>
               <w:rPr>
-                <w:color w:val="6A6458"/>
+                <w:color w:val="38352F"/>
               </w:rPr>
               <w:t>YYYY-MM-DD</w:t>
             </w:r>
             <w:r>
               <w:rPr>
-                <w:color w:val="6A6458"/>
+                <w:color w:val="38352F"/>
               </w:rPr>
               <w:t>〕</w:t>
             </w:r>
@@ -2749,7 +2749,7 @@
             </w:pPr>
             <w:r>
               <w:rPr>
-                <w:color w:val="6A6458"/>
+                <w:color w:val="38352F"/>
               </w:rPr>
               <w:t>〔样机〕</w:t>
             </w:r>
@@ -2779,7 +2779,7 @@
             </w:pPr>
             <w:r>
               <w:rPr>
-                <w:color w:val="6A6458"/>
+                <w:color w:val="38352F"/>
               </w:rPr>
               <w:t>〔姓名〕</w:t>
             </w:r>
@@ -2809,19 +2809,19 @@
             </w:pPr>
             <w:r>
               <w:rPr>
-                <w:color w:val="6A6458"/>
+                <w:color w:val="38352F"/>
               </w:rPr>
               <w:t>〔</w:t>
             </w:r>
             <w:r>
               <w:rPr>
-                <w:color w:val="6A6458"/>
+                <w:color w:val="38352F"/>
               </w:rPr>
               <w:t>YYYY-MM-DD</w:t>
             </w:r>
             <w:r>
               <w:rPr>
-                <w:color w:val="6A6458"/>
+                <w:color w:val="38352F"/>
               </w:rPr>
               <w:t>〕</w:t>
             </w:r>
@@ -2862,7 +2862,7 @@
             <w:tcBorders>
               <w:top w:val="nil"/>
               <w:left w:val="nil"/>
-              <w:bottom w:val="single" w:sz="4" w:space="0" w:color="26231E"/>
+              <w:bottom w:val="single" w:sz="4" w:space="0" w:color="38352F"/>
               <w:right w:val="nil"/>
             </w:tcBorders>
             <w:tcMar>
@@ -2891,7 +2891,7 @@
             <w:tcBorders>
               <w:top w:val="nil"/>
               <w:left w:val="nil"/>
-              <w:bottom w:val="single" w:sz="4" w:space="0" w:color="26231E"/>
+              <w:bottom w:val="single" w:sz="4" w:space="0" w:color="38352F"/>
               <w:right w:val="nil"/>
             </w:tcBorders>
             <w:tcMar>
@@ -2908,7 +2908,7 @@
             </w:pPr>
             <w:r>
               <w:rPr>
-                <w:color w:val="6A6458"/>
+                <w:color w:val="38352F"/>
               </w:rPr>
               <w:t>〔验收报告〕</w:t>
             </w:r>
@@ -2920,7 +2920,7 @@
             <w:tcBorders>
               <w:top w:val="nil"/>
               <w:left w:val="nil"/>
-              <w:bottom w:val="single" w:sz="4" w:space="0" w:color="26231E"/>
+              <w:bottom w:val="single" w:sz="4" w:space="0" w:color="38352F"/>
               <w:right w:val="nil"/>
             </w:tcBorders>
             <w:tcMar>
@@ -2937,7 +2937,7 @@
             </w:pPr>
             <w:r>
               <w:rPr>
-                <w:color w:val="6A6458"/>
+                <w:color w:val="38352F"/>
               </w:rPr>
               <w:t>〔姓名〕</w:t>
             </w:r>
@@ -2949,7 +2949,7 @@
             <w:tcBorders>
               <w:top w:val="nil"/>
               <w:left w:val="nil"/>
-              <w:bottom w:val="single" w:sz="4" w:space="0" w:color="26231E"/>
+              <w:bottom w:val="single" w:sz="4" w:space="0" w:color="38352F"/>
               <w:right w:val="nil"/>
             </w:tcBorders>
             <w:tcMar>
@@ -2966,19 +2966,19 @@
             </w:pPr>
             <w:r>
               <w:rPr>
-                <w:color w:val="6A6458"/>
+                <w:color w:val="38352F"/>
               </w:rPr>
               <w:t>〔</w:t>
             </w:r>
             <w:r>
               <w:rPr>
-                <w:color w:val="6A6458"/>
+                <w:color w:val="38352F"/>
               </w:rPr>
               <w:t>YYYY-MM-DD</w:t>
             </w:r>
             <w:r>
               <w:rPr>
-                <w:color w:val="6A6458"/>
+                <w:color w:val="38352F"/>
               </w:rPr>
               <w:t>〕</w:t>
             </w:r>
@@ -2990,7 +2990,7 @@
             <w:tcBorders>
               <w:top w:val="nil"/>
               <w:left w:val="nil"/>
-              <w:bottom w:val="single" w:sz="4" w:space="0" w:color="26231E"/>
+              <w:bottom w:val="single" w:sz="4" w:space="0" w:color="38352F"/>
               <w:right w:val="nil"/>
             </w:tcBorders>
             <w:tcMar>
@@ -3065,7 +3065,7 @@
                           </a:avLst>
                         </a:prstGeom>
                         <a:solidFill>
-                          <a:srgbClr val="26231E"/>
+                          <a:srgbClr val="38352F"/>
                         </a:solidFill>
                         <a:ln w="12700" cap="flat" cmpd="sng" algn="ctr">
                           <a:noFill/>
@@ -3140,7 +3140,7 @@
           </mc:Choice>
           <mc:Fallback>
             <w:pict>
-              <v:roundrect w14:anchorId="791AC4B3" id="矩形: 圆角 9" o:spid="_x0000_s1029" alt="OH_InkBar" style="width:338.15pt;height:16.1pt;visibility:visible;mso-wrap-style:square;mso-left-percent:-10001;mso-top-percent:-10001;mso-position-horizontal:absolute;mso-position-horizontal-relative:char;mso-position-vertical:absolute;mso-position-vertical-relative:line;mso-left-percent:-10001;mso-top-percent:-10001;v-text-anchor:middle" arcsize="22388f" o:gfxdata="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" fillcolor="#26231e" stroked="f" strokecolor="#09101d [484]" strokeweight="1pt">
+              <v:roundrect w14:anchorId="791AC4B3" id="矩形: 圆角 9" o:spid="_x0000_s1029" alt="OH_InkBar" style="width:338.15pt;height:16.1pt;visibility:visible;mso-wrap-style:square;mso-left-percent:-10001;mso-top-percent:-10001;mso-position-horizontal:absolute;mso-position-horizontal-relative:char;mso-position-vertical:absolute;mso-position-vertical-relative:line;mso-left-percent:-10001;mso-top-percent:-10001;v-text-anchor:middle" arcsize="22388f" o:gfxdata="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" fillcolor="#38352F" stroked="f" strokecolor="#09101d [484]" strokeweight="1pt">
                 <v:stroke joinstyle="miter"/>
                 <v:textbox inset="8pt,0,10pt,0">
                   <w:txbxContent>
@@ -3203,9 +3203,9 @@
           <w:tcPr>
             <w:tcW w:w="2300" w:type="dxa"/>
             <w:tcBorders>
-              <w:top w:val="single" w:sz="18" w:space="0" w:color="26231E"/>
-              <w:left w:val="nil"/>
-              <w:bottom w:val="single" w:sz="4" w:space="0" w:color="26231E"/>
+              <w:top w:val="single" w:sz="18" w:space="0" w:color="38352F"/>
+              <w:left w:val="nil"/>
+              <w:bottom w:val="single" w:sz="4" w:space="0" w:color="38352F"/>
               <w:right w:val="nil"/>
             </w:tcBorders>
             <w:tcMar>
@@ -3230,9 +3230,9 @@
           <w:tcPr>
             <w:tcW w:w="4672" w:type="dxa"/>
             <w:tcBorders>
-              <w:top w:val="single" w:sz="18" w:space="0" w:color="26231E"/>
-              <w:left w:val="nil"/>
-              <w:bottom w:val="single" w:sz="4" w:space="0" w:color="26231E"/>
+              <w:top w:val="single" w:sz="18" w:space="0" w:color="38352F"/>
+              <w:left w:val="nil"/>
+              <w:bottom w:val="single" w:sz="4" w:space="0" w:color="38352F"/>
               <w:right w:val="nil"/>
             </w:tcBorders>
             <w:tcMar>
@@ -3257,9 +3257,9 @@
           <w:tcPr>
             <w:tcW w:w="2100" w:type="dxa"/>
             <w:tcBorders>
-              <w:top w:val="single" w:sz="18" w:space="0" w:color="26231E"/>
-              <w:left w:val="nil"/>
-              <w:bottom w:val="single" w:sz="4" w:space="0" w:color="26231E"/>
+              <w:top w:val="single" w:sz="18" w:space="0" w:color="38352F"/>
+              <w:left w:val="nil"/>
+              <w:bottom w:val="single" w:sz="4" w:space="0" w:color="38352F"/>
               <w:right w:val="nil"/>
             </w:tcBorders>
             <w:tcMar>
@@ -3340,19 +3340,19 @@
             </w:pPr>
             <w:r>
               <w:rPr>
-                <w:color w:val="6A6458"/>
+                <w:color w:val="38352F"/>
               </w:rPr>
               <w:t>〔见</w:t>
             </w:r>
             <w:r>
               <w:rPr>
-                <w:color w:val="6A6458"/>
+                <w:color w:val="38352F"/>
               </w:rPr>
               <w:t xml:space="preserve"> BOM </w:t>
             </w:r>
             <w:r>
               <w:rPr>
-                <w:color w:val="6A6458"/>
+                <w:color w:val="38352F"/>
               </w:rPr>
               <w:t>表〕</w:t>
             </w:r>
@@ -3439,31 +3439,31 @@
             </w:pPr>
             <w:r>
               <w:rPr>
-                <w:color w:val="6A6458"/>
+                <w:color w:val="38352F"/>
               </w:rPr>
               <w:t>〔人数</w:t>
             </w:r>
             <w:r>
               <w:rPr>
-                <w:color w:val="6A6458"/>
+                <w:color w:val="38352F"/>
               </w:rPr>
               <w:t xml:space="preserve"> × </w:t>
             </w:r>
             <w:r>
               <w:rPr>
-                <w:color w:val="6A6458"/>
+                <w:color w:val="38352F"/>
               </w:rPr>
               <w:t>工时</w:t>
             </w:r>
             <w:r>
               <w:rPr>
-                <w:color w:val="6A6458"/>
+                <w:color w:val="38352F"/>
               </w:rPr>
               <w:t xml:space="preserve"> × </w:t>
             </w:r>
             <w:r>
               <w:rPr>
-                <w:color w:val="6A6458"/>
+                <w:color w:val="38352F"/>
               </w:rPr>
               <w:t>单价〕</w:t>
             </w:r>
@@ -3550,7 +3550,7 @@
             </w:pPr>
             <w:r>
               <w:rPr>
-                <w:color w:val="6A6458"/>
+                <w:color w:val="38352F"/>
               </w:rPr>
               <w:t>〔测试、差旅、外协等〕</w:t>
             </w:r>
@@ -3592,7 +3592,7 @@
             <w:tcBorders>
               <w:top w:val="nil"/>
               <w:left w:val="nil"/>
-              <w:bottom w:val="single" w:sz="4" w:space="0" w:color="26231E"/>
+              <w:bottom w:val="single" w:sz="4" w:space="0" w:color="38352F"/>
               <w:right w:val="nil"/>
             </w:tcBorders>
             <w:tcMar>
@@ -3622,7 +3622,7 @@
             <w:tcBorders>
               <w:top w:val="nil"/>
               <w:left w:val="nil"/>
-              <w:bottom w:val="single" w:sz="4" w:space="0" w:color="26231E"/>
+              <w:bottom w:val="single" w:sz="4" w:space="0" w:color="38352F"/>
               <w:right w:val="nil"/>
             </w:tcBorders>
             <w:tcMar>
@@ -3645,7 +3645,7 @@
             <w:tcBorders>
               <w:top w:val="nil"/>
               <w:left w:val="nil"/>
-              <w:bottom w:val="single" w:sz="4" w:space="0" w:color="26231E"/>
+              <w:bottom w:val="single" w:sz="4" w:space="0" w:color="38352F"/>
               <w:right w:val="nil"/>
             </w:tcBorders>
             <w:tcMar>
@@ -3728,7 +3728,7 @@
                           </a:avLst>
                         </a:prstGeom>
                         <a:solidFill>
-                          <a:srgbClr val="26231E"/>
+                          <a:srgbClr val="38352F"/>
                         </a:solidFill>
                         <a:ln w="12700" cap="flat" cmpd="sng" algn="ctr">
                           <a:noFill/>
@@ -3803,7 +3803,7 @@
           </mc:Choice>
           <mc:Fallback>
             <w:pict>
-              <v:roundrect w14:anchorId="326CC277" id="矩形: 圆角 10" o:spid="_x0000_s1030" alt="OH_InkBar" style="width:363.8pt;height:16.1pt;visibility:visible;mso-wrap-style:square;mso-left-percent:-10001;mso-top-percent:-10001;mso-position-horizontal:absolute;mso-position-horizontal-relative:char;mso-position-vertical:absolute;mso-position-vertical-relative:line;mso-left-percent:-10001;mso-top-percent:-10001;v-text-anchor:middle" arcsize="22388f" o:gfxdata="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" fillcolor="#26231e" stroked="f" strokecolor="#09101d [484]" strokeweight="1pt">
+              <v:roundrect w14:anchorId="326CC277" id="矩形: 圆角 10" o:spid="_x0000_s1030" alt="OH_InkBar" style="width:363.8pt;height:16.1pt;visibility:visible;mso-wrap-style:square;mso-left-percent:-10001;mso-top-percent:-10001;mso-position-horizontal:absolute;mso-position-horizontal-relative:char;mso-position-vertical:absolute;mso-position-vertical-relative:line;mso-left-percent:-10001;mso-top-percent:-10001;v-text-anchor:middle" arcsize="22388f" o:gfxdata="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" fillcolor="#38352F" stroked="f" strokecolor="#09101d [484]" strokeweight="1pt">
                 <v:stroke joinstyle="miter"/>
                 <v:textbox inset="8pt,0,10pt,0">
                   <w:txbxContent>
@@ -3866,9 +3866,9 @@
           <w:tcPr>
             <w:tcW w:w="2300" w:type="dxa"/>
             <w:tcBorders>
-              <w:top w:val="single" w:sz="18" w:space="0" w:color="26231E"/>
-              <w:left w:val="nil"/>
-              <w:bottom w:val="single" w:sz="4" w:space="0" w:color="26231E"/>
+              <w:top w:val="single" w:sz="18" w:space="0" w:color="38352F"/>
+              <w:left w:val="nil"/>
+              <w:bottom w:val="single" w:sz="4" w:space="0" w:color="38352F"/>
               <w:right w:val="nil"/>
             </w:tcBorders>
             <w:tcMar>
@@ -3893,9 +3893,9 @@
           <w:tcPr>
             <w:tcW w:w="4672" w:type="dxa"/>
             <w:tcBorders>
-              <w:top w:val="single" w:sz="18" w:space="0" w:color="26231E"/>
-              <w:left w:val="nil"/>
-              <w:bottom w:val="single" w:sz="4" w:space="0" w:color="26231E"/>
+              <w:top w:val="single" w:sz="18" w:space="0" w:color="38352F"/>
+              <w:left w:val="nil"/>
+              <w:bottom w:val="single" w:sz="4" w:space="0" w:color="38352F"/>
               <w:right w:val="nil"/>
             </w:tcBorders>
             <w:tcMar>
@@ -3920,9 +3920,9 @@
           <w:tcPr>
             <w:tcW w:w="2100" w:type="dxa"/>
             <w:tcBorders>
-              <w:top w:val="single" w:sz="18" w:space="0" w:color="26231E"/>
-              <w:left w:val="nil"/>
-              <w:bottom w:val="single" w:sz="4" w:space="0" w:color="26231E"/>
+              <w:top w:val="single" w:sz="18" w:space="0" w:color="38352F"/>
+              <w:left w:val="nil"/>
+              <w:bottom w:val="single" w:sz="4" w:space="0" w:color="38352F"/>
               <w:right w:val="nil"/>
             </w:tcBorders>
             <w:tcMar>
@@ -3999,7 +3999,7 @@
             </w:pPr>
             <w:r>
               <w:rPr>
-                <w:color w:val="6A6458"/>
+                <w:color w:val="38352F"/>
               </w:rPr>
               <w:t>〔订单金额、降本金额等〕</w:t>
             </w:r>
@@ -4040,7 +4040,7 @@
             <w:tcBorders>
               <w:top w:val="nil"/>
               <w:left w:val="nil"/>
-              <w:bottom w:val="single" w:sz="4" w:space="0" w:color="26231E"/>
+              <w:bottom w:val="single" w:sz="4" w:space="0" w:color="38352F"/>
               <w:right w:val="nil"/>
             </w:tcBorders>
             <w:tcMar>
@@ -4066,7 +4066,7 @@
             <w:tcBorders>
               <w:top w:val="nil"/>
               <w:left w:val="nil"/>
-              <w:bottom w:val="single" w:sz="4" w:space="0" w:color="26231E"/>
+              <w:bottom w:val="single" w:sz="4" w:space="0" w:color="38352F"/>
               <w:right w:val="nil"/>
             </w:tcBorders>
             <w:tcMar>
@@ -4083,7 +4083,7 @@
             </w:pPr>
             <w:r>
               <w:rPr>
-                <w:color w:val="6A6458"/>
+                <w:color w:val="38352F"/>
               </w:rPr>
               <w:t>〔技术积累、客户关系、复用价值等〕</w:t>
             </w:r>
@@ -4095,7 +4095,7 @@
             <w:tcBorders>
               <w:top w:val="nil"/>
               <w:left w:val="nil"/>
-              <w:bottom w:val="single" w:sz="4" w:space="0" w:color="26231E"/>
+              <w:bottom w:val="single" w:sz="4" w:space="0" w:color="38352F"/>
               <w:right w:val="nil"/>
             </w:tcBorders>
             <w:tcMar>
@@ -4169,7 +4169,7 @@
                           </a:avLst>
                         </a:prstGeom>
                         <a:solidFill>
-                          <a:srgbClr val="26231E"/>
+                          <a:srgbClr val="38352F"/>
                         </a:solidFill>
                         <a:ln w="12700" cap="flat" cmpd="sng" algn="ctr">
                           <a:noFill/>
@@ -4244,7 +4244,7 @@
           </mc:Choice>
           <mc:Fallback>
             <w:pict>
-              <v:roundrect w14:anchorId="4494E396" id="矩形: 圆角 11" o:spid="_x0000_s1031" alt="OH_InkBar" style="width:390.1pt;height:16.1pt;visibility:visible;mso-wrap-style:square;mso-left-percent:-10001;mso-top-percent:-10001;mso-position-horizontal:absolute;mso-position-horizontal-relative:char;mso-position-vertical:absolute;mso-position-vertical-relative:line;mso-left-percent:-10001;mso-top-percent:-10001;v-text-anchor:middle" arcsize="22388f" o:gfxdata="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" fillcolor="#26231e" stroked="f" strokecolor="#09101d [484]" strokeweight="1pt">
+              <v:roundrect w14:anchorId="4494E396" id="矩形: 圆角 11" o:spid="_x0000_s1031" alt="OH_InkBar" style="width:390.1pt;height:16.1pt;visibility:visible;mso-wrap-style:square;mso-left-percent:-10001;mso-top-percent:-10001;mso-position-horizontal:absolute;mso-position-horizontal-relative:char;mso-position-vertical:absolute;mso-position-vertical-relative:line;mso-left-percent:-10001;mso-top-percent:-10001;v-text-anchor:middle" arcsize="22388f" o:gfxdata="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" fillcolor="#38352F" stroked="f" strokecolor="#09101d [484]" strokeweight="1pt">
                 <v:stroke joinstyle="miter"/>
                 <v:textbox inset="8pt,0,10pt,0">
                   <w:txbxContent>
@@ -4339,7 +4339,7 @@
                           </a:avLst>
                         </a:prstGeom>
                         <a:solidFill>
-                          <a:srgbClr val="26231E"/>
+                          <a:srgbClr val="38352F"/>
                         </a:solidFill>
                         <a:ln w="12700" cap="flat" cmpd="sng" algn="ctr">
                           <a:noFill/>
@@ -4414,7 +4414,7 @@
           </mc:Choice>
           <mc:Fallback>
             <w:pict>
-              <v:roundrect w14:anchorId="729245D4" id="矩形: 圆角 12" o:spid="_x0000_s1032" alt="OH_InkBar" style="width:338.15pt;height:16.1pt;visibility:visible;mso-wrap-style:square;mso-left-percent:-10001;mso-top-percent:-10001;mso-position-horizontal:absolute;mso-position-horizontal-relative:char;mso-position-vertical:absolute;mso-position-vertical-relative:line;mso-left-percent:-10001;mso-top-percent:-10001;v-text-anchor:middle" arcsize="22388f" o:gfxdata="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" fillcolor="#26231e" stroked="f" strokecolor="#09101d [484]" strokeweight="1pt">
+              <v:roundrect w14:anchorId="729245D4" id="矩形: 圆角 12" o:spid="_x0000_s1032" alt="OH_InkBar" style="width:338.15pt;height:16.1pt;visibility:visible;mso-wrap-style:square;mso-left-percent:-10001;mso-top-percent:-10001;mso-position-horizontal:absolute;mso-position-horizontal-relative:char;mso-position-vertical:absolute;mso-position-vertical-relative:line;mso-left-percent:-10001;mso-top-percent:-10001;v-text-anchor:middle" arcsize="22388f" o:gfxdata="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" fillcolor="#38352F" stroked="f" strokecolor="#09101d [484]" strokeweight="1pt">
                 <v:stroke joinstyle="miter"/>
                 <v:textbox inset="8pt,0,10pt,0">
                   <w:txbxContent>
@@ -4485,9 +4485,9 @@
           <w:tcPr>
             <w:tcW w:w="1872" w:type="dxa"/>
             <w:tcBorders>
-              <w:top w:val="single" w:sz="18" w:space="0" w:color="26231E"/>
-              <w:left w:val="nil"/>
-              <w:bottom w:val="single" w:sz="4" w:space="0" w:color="26231E"/>
+              <w:top w:val="single" w:sz="18" w:space="0" w:color="38352F"/>
+              <w:left w:val="nil"/>
+              <w:bottom w:val="single" w:sz="4" w:space="0" w:color="38352F"/>
               <w:right w:val="nil"/>
             </w:tcBorders>
             <w:tcMar>
@@ -4512,9 +4512,9 @@
           <w:tcPr>
             <w:tcW w:w="720" w:type="dxa"/>
             <w:tcBorders>
-              <w:top w:val="single" w:sz="18" w:space="0" w:color="26231E"/>
-              <w:left w:val="nil"/>
-              <w:bottom w:val="single" w:sz="4" w:space="0" w:color="26231E"/>
+              <w:top w:val="single" w:sz="18" w:space="0" w:color="38352F"/>
+              <w:left w:val="nil"/>
+              <w:bottom w:val="single" w:sz="4" w:space="0" w:color="38352F"/>
               <w:right w:val="nil"/>
             </w:tcBorders>
             <w:tcMar>
@@ -4540,9 +4540,9 @@
           <w:tcPr>
             <w:tcW w:w="720" w:type="dxa"/>
             <w:tcBorders>
-              <w:top w:val="single" w:sz="18" w:space="0" w:color="26231E"/>
-              <w:left w:val="nil"/>
-              <w:bottom w:val="single" w:sz="4" w:space="0" w:color="26231E"/>
+              <w:top w:val="single" w:sz="18" w:space="0" w:color="38352F"/>
+              <w:left w:val="nil"/>
+              <w:bottom w:val="single" w:sz="4" w:space="0" w:color="38352F"/>
               <w:right w:val="nil"/>
             </w:tcBorders>
             <w:tcMar>
@@ -4568,9 +4568,9 @@
           <w:tcPr>
             <w:tcW w:w="720" w:type="dxa"/>
             <w:tcBorders>
-              <w:top w:val="single" w:sz="18" w:space="0" w:color="26231E"/>
-              <w:left w:val="nil"/>
-              <w:bottom w:val="single" w:sz="4" w:space="0" w:color="26231E"/>
+              <w:top w:val="single" w:sz="18" w:space="0" w:color="38352F"/>
+              <w:left w:val="nil"/>
+              <w:bottom w:val="single" w:sz="4" w:space="0" w:color="38352F"/>
               <w:right w:val="nil"/>
             </w:tcBorders>
             <w:tcMar>
@@ -4596,9 +4596,9 @@
           <w:tcPr>
             <w:tcW w:w="720" w:type="dxa"/>
             <w:tcBorders>
-              <w:top w:val="single" w:sz="18" w:space="0" w:color="26231E"/>
-              <w:left w:val="nil"/>
-              <w:bottom w:val="single" w:sz="4" w:space="0" w:color="26231E"/>
+              <w:top w:val="single" w:sz="18" w:space="0" w:color="38352F"/>
+              <w:left w:val="nil"/>
+              <w:bottom w:val="single" w:sz="4" w:space="0" w:color="38352F"/>
               <w:right w:val="nil"/>
             </w:tcBorders>
             <w:tcMar>
@@ -4624,9 +4624,9 @@
           <w:tcPr>
             <w:tcW w:w="720" w:type="dxa"/>
             <w:tcBorders>
-              <w:top w:val="single" w:sz="18" w:space="0" w:color="26231E"/>
-              <w:left w:val="nil"/>
-              <w:bottom w:val="single" w:sz="4" w:space="0" w:color="26231E"/>
+              <w:top w:val="single" w:sz="18" w:space="0" w:color="38352F"/>
+              <w:left w:val="nil"/>
+              <w:bottom w:val="single" w:sz="4" w:space="0" w:color="38352F"/>
               <w:right w:val="nil"/>
             </w:tcBorders>
             <w:tcMar>
@@ -4652,9 +4652,9 @@
           <w:tcPr>
             <w:tcW w:w="720" w:type="dxa"/>
             <w:tcBorders>
-              <w:top w:val="single" w:sz="18" w:space="0" w:color="26231E"/>
-              <w:left w:val="nil"/>
-              <w:bottom w:val="single" w:sz="4" w:space="0" w:color="26231E"/>
+              <w:top w:val="single" w:sz="18" w:space="0" w:color="38352F"/>
+              <w:left w:val="nil"/>
+              <w:bottom w:val="single" w:sz="4" w:space="0" w:color="38352F"/>
               <w:right w:val="nil"/>
             </w:tcBorders>
             <w:tcMar>
@@ -4680,9 +4680,9 @@
           <w:tcPr>
             <w:tcW w:w="720" w:type="dxa"/>
             <w:tcBorders>
-              <w:top w:val="single" w:sz="18" w:space="0" w:color="26231E"/>
-              <w:left w:val="nil"/>
-              <w:bottom w:val="single" w:sz="4" w:space="0" w:color="26231E"/>
+              <w:top w:val="single" w:sz="18" w:space="0" w:color="38352F"/>
+              <w:left w:val="nil"/>
+              <w:bottom w:val="single" w:sz="4" w:space="0" w:color="38352F"/>
               <w:right w:val="nil"/>
             </w:tcBorders>
             <w:tcMar>
@@ -4708,9 +4708,9 @@
           <w:tcPr>
             <w:tcW w:w="720" w:type="dxa"/>
             <w:tcBorders>
-              <w:top w:val="single" w:sz="18" w:space="0" w:color="26231E"/>
-              <w:left w:val="nil"/>
-              <w:bottom w:val="single" w:sz="4" w:space="0" w:color="26231E"/>
+              <w:top w:val="single" w:sz="18" w:space="0" w:color="38352F"/>
+              <w:left w:val="nil"/>
+              <w:bottom w:val="single" w:sz="4" w:space="0" w:color="38352F"/>
               <w:right w:val="nil"/>
             </w:tcBorders>
             <w:tcMar>
@@ -4736,9 +4736,9 @@
           <w:tcPr>
             <w:tcW w:w="720" w:type="dxa"/>
             <w:tcBorders>
-              <w:top w:val="single" w:sz="18" w:space="0" w:color="26231E"/>
-              <w:left w:val="nil"/>
-              <w:bottom w:val="single" w:sz="4" w:space="0" w:color="26231E"/>
+              <w:top w:val="single" w:sz="18" w:space="0" w:color="38352F"/>
+              <w:left w:val="nil"/>
+              <w:bottom w:val="single" w:sz="4" w:space="0" w:color="38352F"/>
               <w:right w:val="nil"/>
             </w:tcBorders>
             <w:tcMar>
@@ -4764,9 +4764,9 @@
           <w:tcPr>
             <w:tcW w:w="720" w:type="dxa"/>
             <w:tcBorders>
-              <w:top w:val="single" w:sz="18" w:space="0" w:color="26231E"/>
-              <w:left w:val="nil"/>
-              <w:bottom w:val="single" w:sz="4" w:space="0" w:color="26231E"/>
+              <w:top w:val="single" w:sz="18" w:space="0" w:color="38352F"/>
+              <w:left w:val="nil"/>
+              <w:bottom w:val="single" w:sz="4" w:space="0" w:color="38352F"/>
               <w:right w:val="nil"/>
             </w:tcBorders>
             <w:tcMar>
@@ -7817,7 +7817,7 @@
             <w:tcBorders>
               <w:top w:val="nil"/>
               <w:left w:val="nil"/>
-              <w:bottom w:val="single" w:sz="4" w:space="0" w:color="26231E"/>
+              <w:bottom w:val="single" w:sz="4" w:space="0" w:color="38352F"/>
               <w:right w:val="nil"/>
             </w:tcBorders>
             <w:tcMar>
@@ -7843,7 +7843,7 @@
             <w:tcBorders>
               <w:top w:val="nil"/>
               <w:left w:val="nil"/>
-              <w:bottom w:val="single" w:sz="4" w:space="0" w:color="26231E"/>
+              <w:bottom w:val="single" w:sz="4" w:space="0" w:color="38352F"/>
               <w:right w:val="nil"/>
             </w:tcBorders>
             <w:tcMar>
@@ -7867,7 +7867,7 @@
             <w:tcBorders>
               <w:top w:val="nil"/>
               <w:left w:val="nil"/>
-              <w:bottom w:val="single" w:sz="4" w:space="0" w:color="26231E"/>
+              <w:bottom w:val="single" w:sz="4" w:space="0" w:color="38352F"/>
               <w:right w:val="nil"/>
             </w:tcBorders>
             <w:tcMar>
@@ -7891,7 +7891,7 @@
             <w:tcBorders>
               <w:top w:val="nil"/>
               <w:left w:val="nil"/>
-              <w:bottom w:val="single" w:sz="4" w:space="0" w:color="26231E"/>
+              <w:bottom w:val="single" w:sz="4" w:space="0" w:color="38352F"/>
               <w:right w:val="nil"/>
             </w:tcBorders>
             <w:tcMar>
@@ -7915,7 +7915,7 @@
             <w:tcBorders>
               <w:top w:val="nil"/>
               <w:left w:val="nil"/>
-              <w:bottom w:val="single" w:sz="4" w:space="0" w:color="26231E"/>
+              <w:bottom w:val="single" w:sz="4" w:space="0" w:color="38352F"/>
               <w:right w:val="nil"/>
             </w:tcBorders>
             <w:tcMar>
@@ -7939,7 +7939,7 @@
             <w:tcBorders>
               <w:top w:val="nil"/>
               <w:left w:val="nil"/>
-              <w:bottom w:val="single" w:sz="4" w:space="0" w:color="26231E"/>
+              <w:bottom w:val="single" w:sz="4" w:space="0" w:color="38352F"/>
               <w:right w:val="nil"/>
             </w:tcBorders>
             <w:tcMar>
@@ -7963,7 +7963,7 @@
             <w:tcBorders>
               <w:top w:val="nil"/>
               <w:left w:val="nil"/>
-              <w:bottom w:val="single" w:sz="4" w:space="0" w:color="26231E"/>
+              <w:bottom w:val="single" w:sz="4" w:space="0" w:color="38352F"/>
               <w:right w:val="nil"/>
             </w:tcBorders>
             <w:tcMar>
@@ -7987,7 +7987,7 @@
             <w:tcBorders>
               <w:top w:val="nil"/>
               <w:left w:val="nil"/>
-              <w:bottom w:val="single" w:sz="4" w:space="0" w:color="26231E"/>
+              <w:bottom w:val="single" w:sz="4" w:space="0" w:color="38352F"/>
               <w:right w:val="nil"/>
             </w:tcBorders>
             <w:tcMar>
@@ -8011,7 +8011,7 @@
             <w:tcBorders>
               <w:top w:val="nil"/>
               <w:left w:val="nil"/>
-              <w:bottom w:val="single" w:sz="4" w:space="0" w:color="26231E"/>
+              <w:bottom w:val="single" w:sz="4" w:space="0" w:color="38352F"/>
               <w:right w:val="nil"/>
             </w:tcBorders>
             <w:tcMar>
@@ -8035,7 +8035,7 @@
             <w:tcBorders>
               <w:top w:val="nil"/>
               <w:left w:val="nil"/>
-              <w:bottom w:val="single" w:sz="4" w:space="0" w:color="26231E"/>
+              <w:bottom w:val="single" w:sz="4" w:space="0" w:color="38352F"/>
               <w:right w:val="nil"/>
             </w:tcBorders>
             <w:tcMar>
@@ -8062,7 +8062,7 @@
             <w:tcBorders>
               <w:top w:val="nil"/>
               <w:left w:val="nil"/>
-              <w:bottom w:val="single" w:sz="4" w:space="0" w:color="26231E"/>
+              <w:bottom w:val="single" w:sz="4" w:space="0" w:color="38352F"/>
               <w:right w:val="nil"/>
             </w:tcBorders>
             <w:tcMar>
@@ -8088,7 +8088,7 @@
       </w:pPr>
       <w:r>
         <w:rPr>
-          <w:color w:val="6A6458"/>
+          <w:color w:val="38352F"/>
           <w:sz w:val="17"/>
           <w:szCs w:val="17"/>
         </w:rPr>
@@ -8096,7 +8096,7 @@
       </w:r>
       <w:r>
         <w:rPr>
-          <w:color w:val="6A6458"/>
+          <w:color w:val="38352F"/>
           <w:sz w:val="17"/>
           <w:szCs w:val="17"/>
         </w:rPr>
@@ -8104,7 +8104,7 @@
       </w:r>
       <w:r>
         <w:rPr>
-          <w:color w:val="6A6458"/>
+          <w:color w:val="38352F"/>
           <w:sz w:val="17"/>
           <w:szCs w:val="17"/>
         </w:rPr>
@@ -8112,7 +8112,7 @@
       </w:r>
       <w:r>
         <w:rPr>
-          <w:color w:val="6A6458"/>
+          <w:color w:val="38352F"/>
           <w:sz w:val="17"/>
           <w:szCs w:val="17"/>
         </w:rPr>
@@ -8174,7 +8174,7 @@
                           </a:avLst>
                         </a:prstGeom>
                         <a:solidFill>
-                          <a:srgbClr val="26231E"/>
+                          <a:srgbClr val="38352F"/>
                         </a:solidFill>
                         <a:ln w="12700" cap="flat" cmpd="sng" algn="ctr">
                           <a:noFill/>
@@ -8249,7 +8249,7 @@
           </mc:Choice>
           <mc:Fallback>
             <w:pict>
-              <v:roundrect w14:anchorId="79875939" id="矩形: 圆角 13" o:spid="_x0000_s1033" alt="OH_InkBar" style="width:325pt;height:16.1pt;visibility:visible;mso-wrap-style:square;mso-left-percent:-10001;mso-top-percent:-10001;mso-position-horizontal:absolute;mso-position-horizontal-relative:char;mso-position-vertical:absolute;mso-position-vertical-relative:line;mso-left-percent:-10001;mso-top-percent:-10001;v-text-anchor:middle" arcsize="22388f" o:gfxdata="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" fillcolor="#26231e" stroked="f" strokecolor="#09101d [484]" strokeweight="1pt">
+              <v:roundrect w14:anchorId="79875939" id="矩形: 圆角 13" o:spid="_x0000_s1033" alt="OH_InkBar" style="width:325pt;height:16.1pt;visibility:visible;mso-wrap-style:square;mso-left-percent:-10001;mso-top-percent:-10001;mso-position-horizontal:absolute;mso-position-horizontal-relative:char;mso-position-vertical:absolute;mso-position-vertical-relative:line;mso-left-percent:-10001;mso-top-percent:-10001;v-text-anchor:middle" arcsize="22388f" o:gfxdata="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" fillcolor="#38352F" stroked="f" strokecolor="#09101d [484]" strokeweight="1pt">
                 <v:stroke joinstyle="miter"/>
                 <v:textbox inset="8pt,0,10pt,0">
                   <w:txbxContent>
@@ -8314,9 +8314,9 @@
           <w:tcPr>
             <w:tcW w:w="1100" w:type="dxa"/>
             <w:tcBorders>
-              <w:top w:val="single" w:sz="18" w:space="0" w:color="26231E"/>
-              <w:left w:val="nil"/>
-              <w:bottom w:val="single" w:sz="4" w:space="0" w:color="26231E"/>
+              <w:top w:val="single" w:sz="18" w:space="0" w:color="38352F"/>
+              <w:left w:val="nil"/>
+              <w:bottom w:val="single" w:sz="4" w:space="0" w:color="38352F"/>
               <w:right w:val="nil"/>
             </w:tcBorders>
             <w:tcMar>
@@ -8340,9 +8340,9 @@
           <w:tcPr>
             <w:tcW w:w="3200" w:type="dxa"/>
             <w:tcBorders>
-              <w:top w:val="single" w:sz="18" w:space="0" w:color="26231E"/>
-              <w:left w:val="nil"/>
-              <w:bottom w:val="single" w:sz="4" w:space="0" w:color="26231E"/>
+              <w:top w:val="single" w:sz="18" w:space="0" w:color="38352F"/>
+              <w:left w:val="nil"/>
+              <w:bottom w:val="single" w:sz="4" w:space="0" w:color="38352F"/>
               <w:right w:val="nil"/>
             </w:tcBorders>
             <w:tcMar>
@@ -8366,9 +8366,9 @@
           <w:tcPr>
             <w:tcW w:w="2572" w:type="dxa"/>
             <w:tcBorders>
-              <w:top w:val="single" w:sz="18" w:space="0" w:color="26231E"/>
-              <w:left w:val="nil"/>
-              <w:bottom w:val="single" w:sz="4" w:space="0" w:color="26231E"/>
+              <w:top w:val="single" w:sz="18" w:space="0" w:color="38352F"/>
+              <w:left w:val="nil"/>
+              <w:bottom w:val="single" w:sz="4" w:space="0" w:color="38352F"/>
               <w:right w:val="nil"/>
             </w:tcBorders>
             <w:tcMar>
@@ -8392,9 +8392,9 @@
           <w:tcPr>
             <w:tcW w:w="1200" w:type="dxa"/>
             <w:tcBorders>
-              <w:top w:val="single" w:sz="18" w:space="0" w:color="26231E"/>
-              <w:left w:val="nil"/>
-              <w:bottom w:val="single" w:sz="4" w:space="0" w:color="26231E"/>
+              <w:top w:val="single" w:sz="18" w:space="0" w:color="38352F"/>
+              <w:left w:val="nil"/>
+              <w:bottom w:val="single" w:sz="4" w:space="0" w:color="38352F"/>
               <w:right w:val="nil"/>
             </w:tcBorders>
             <w:tcMar>
@@ -8418,9 +8418,9 @@
           <w:tcPr>
             <w:tcW w:w="1000" w:type="dxa"/>
             <w:tcBorders>
-              <w:top w:val="single" w:sz="18" w:space="0" w:color="26231E"/>
-              <w:left w:val="nil"/>
-              <w:bottom w:val="single" w:sz="4" w:space="0" w:color="26231E"/>
+              <w:top w:val="single" w:sz="18" w:space="0" w:color="38352F"/>
+              <w:left w:val="nil"/>
+              <w:bottom w:val="single" w:sz="4" w:space="0" w:color="38352F"/>
               <w:right w:val="nil"/>
             </w:tcBorders>
             <w:tcMar>
@@ -11037,7 +11037,7 @@
             <w:tcBorders>
               <w:top w:val="nil"/>
               <w:left w:val="nil"/>
-              <w:bottom w:val="single" w:sz="4" w:space="0" w:color="26231E"/>
+              <w:bottom w:val="single" w:sz="4" w:space="0" w:color="38352F"/>
               <w:right w:val="nil"/>
             </w:tcBorders>
             <w:tcMar>
@@ -11183,7 +11183,7 @@
             <w:tcBorders>
               <w:top w:val="nil"/>
               <w:left w:val="nil"/>
-              <w:bottom w:val="single" w:sz="4" w:space="0" w:color="26231E"/>
+              <w:bottom w:val="single" w:sz="4" w:space="0" w:color="38352F"/>
               <w:right w:val="nil"/>
             </w:tcBorders>
           </w:tcPr>
@@ -11195,7 +11195,7 @@
             <w:tcBorders>
               <w:top w:val="nil"/>
               <w:left w:val="nil"/>
-              <w:bottom w:val="single" w:sz="4" w:space="0" w:color="26231E"/>
+              <w:bottom w:val="single" w:sz="4" w:space="0" w:color="38352F"/>
               <w:right w:val="nil"/>
             </w:tcBorders>
             <w:tcMar>
@@ -11223,7 +11223,7 @@
             <w:tcBorders>
               <w:top w:val="nil"/>
               <w:left w:val="nil"/>
-              <w:bottom w:val="single" w:sz="4" w:space="0" w:color="26231E"/>
+              <w:bottom w:val="single" w:sz="4" w:space="0" w:color="38352F"/>
               <w:right w:val="nil"/>
             </w:tcBorders>
             <w:tcMar>
@@ -11254,7 +11254,7 @@
             <w:tcBorders>
               <w:top w:val="nil"/>
               <w:left w:val="nil"/>
-              <w:bottom w:val="single" w:sz="4" w:space="0" w:color="26231E"/>
+              <w:bottom w:val="single" w:sz="4" w:space="0" w:color="38352F"/>
               <w:right w:val="nil"/>
             </w:tcBorders>
             <w:tcMar>
@@ -11279,7 +11279,7 @@
             <w:tcBorders>
               <w:top w:val="nil"/>
               <w:left w:val="nil"/>
-              <w:bottom w:val="single" w:sz="4" w:space="0" w:color="26231E"/>
+              <w:bottom w:val="single" w:sz="4" w:space="0" w:color="38352F"/>
               <w:right w:val="nil"/>
             </w:tcBorders>
             <w:tcMar>
@@ -11352,7 +11352,7 @@
                           </a:avLst>
                         </a:prstGeom>
                         <a:solidFill>
-                          <a:srgbClr val="26231E"/>
+                          <a:srgbClr val="38352F"/>
                         </a:solidFill>
                         <a:ln w="12700" cap="flat" cmpd="sng" algn="ctr">
                           <a:noFill/>
@@ -11404,7 +11404,7 @@
           </mc:Choice>
           <mc:Fallback>
             <w:pict>
-              <v:roundrect w14:anchorId="527CEBD4" id="矩形: 圆角 14" o:spid="_x0000_s1026" alt="OH_InkBar" style="width:338.15pt;height:16.1pt;visibility:visible;mso-wrap-style:square;mso-left-percent:-10001;mso-top-percent:-10001;mso-position-horizontal:absolute;mso-position-horizontal-relative:char;mso-position-vertical:absolute;mso-position-vertical-relative:line;mso-left-percent:-10001;mso-top-percent:-10001;v-text-anchor:middle" arcsize="22388f" o:gfxdata="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" fillcolor="#26231e" stroked="f" strokecolor="#09101d [484]" strokeweight="1pt">
+              <v:roundrect w14:anchorId="527CEBD4" id="矩形: 圆角 14" o:spid="_x0000_s1026" alt="OH_InkBar" style="width:338.15pt;height:16.1pt;visibility:visible;mso-wrap-style:square;mso-left-percent:-10001;mso-top-percent:-10001;mso-position-horizontal:absolute;mso-position-horizontal-relative:char;mso-position-vertical:absolute;mso-position-vertical-relative:line;mso-left-percent:-10001;mso-top-percent:-10001;v-text-anchor:middle" arcsize="22388f" o:gfxdata="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" fillcolor="#38352F" stroked="f" strokecolor="#09101d [484]" strokeweight="1pt">
                 <v:stroke joinstyle="miter"/>
                 <w10:anchorlock/>
               </v:roundrect>
@@ -11526,7 +11526,7 @@
                           </a:avLst>
                         </a:prstGeom>
                         <a:solidFill>
-                          <a:srgbClr val="26231E"/>
+                          <a:srgbClr val="38352F"/>
                         </a:solidFill>
                         <a:ln w="12700" cap="flat" cmpd="sng" algn="ctr">
                           <a:noFill/>
@@ -11578,7 +11578,7 @@
           </mc:Choice>
           <mc:Fallback>
             <w:pict>
-              <v:roundrect w14:anchorId="3E9C85FF" id="矩形: 圆角 15" o:spid="_x0000_s1026" alt="OH_InkBar" style="width:350.65pt;height:16.1pt;visibility:visible;mso-wrap-style:square;mso-left-percent:-10001;mso-top-percent:-10001;mso-position-horizontal:absolute;mso-position-horizontal-relative:char;mso-position-vertical:absolute;mso-position-vertical-relative:line;mso-left-percent:-10001;mso-top-percent:-10001;v-text-anchor:middle" arcsize="22388f" o:gfxdata="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" fillcolor="#26231e" stroked="f" strokecolor="#09101d [484]" strokeweight="1pt">
+              <v:roundrect w14:anchorId="3E9C85FF" id="矩形: 圆角 15" o:spid="_x0000_s1026" alt="OH_InkBar" style="width:350.65pt;height:16.1pt;visibility:visible;mso-wrap-style:square;mso-left-percent:-10001;mso-top-percent:-10001;mso-position-horizontal:absolute;mso-position-horizontal-relative:char;mso-position-vertical:absolute;mso-position-vertical-relative:line;mso-left-percent:-10001;mso-top-percent:-10001;v-text-anchor:middle" arcsize="22388f" o:gfxdata="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" fillcolor="#38352F" stroked="f" strokecolor="#09101d [484]" strokeweight="1pt">
                 <v:stroke joinstyle="miter"/>
                 <w10:anchorlock/>
               </v:roundrect>
@@ -11617,7 +11617,7 @@
           <w:tcPr>
             <w:tcW w:w="4536" w:type="dxa"/>
             <w:tcBorders>
-              <w:top w:val="single" w:sz="18" w:space="0" w:color="26231E"/>
+              <w:top w:val="single" w:sz="18" w:space="0" w:color="38352F"/>
               <w:left w:val="nil"/>
               <w:bottom w:val="nil"/>
               <w:right w:val="single" w:sz="4" w:space="0" w:color="D5D1C8"/>
@@ -11649,7 +11649,7 @@
           <w:tcPr>
             <w:tcW w:w="4536" w:type="dxa"/>
             <w:tcBorders>
-              <w:top w:val="single" w:sz="18" w:space="0" w:color="26231E"/>
+              <w:top w:val="single" w:sz="18" w:space="0" w:color="38352F"/>
               <w:left w:val="nil"/>
               <w:bottom w:val="nil"/>
               <w:right w:val="nil"/>
@@ -11880,7 +11880,7 @@
             <w:tcBorders>
               <w:top w:val="nil"/>
               <w:left w:val="nil"/>
-              <w:bottom w:val="single" w:sz="4" w:space="0" w:color="26231E"/>
+              <w:bottom w:val="single" w:sz="4" w:space="0" w:color="38352F"/>
               <w:right w:val="nil"/>
             </w:tcBorders>
           </w:tcPr>
@@ -11941,7 +11941,7 @@
     <w:r>
       <w:rPr>
         <w:rFonts w:ascii="Bahnschrift" w:hAnsi="Bahnschrift"/>
-        <w:color w:val="6A6458"/>
+        <w:color w:val="38352F"/>
         <w:sz w:val="15"/>
         <w:szCs w:val="15"/>
       </w:rPr>
@@ -12014,7 +12014,7 @@
     <w:r>
       <w:rPr>
         <w:rFonts w:ascii="Bahnschrift" w:hAnsi="Bahnschrift"/>
-        <w:color w:val="6A6458"/>
+        <w:color w:val="38352F"/>
         <w:sz w:val="15"/>
         <w:szCs w:val="15"/>
       </w:rPr>
@@ -12157,7 +12157,7 @@
     </w:r>
     <w:r>
       <w:rPr>
-        <w:color w:val="6A6458"/>
+        <w:color w:val="38352F"/>
         <w:sz w:val="17"/>
         <w:szCs w:val="17"/>
       </w:rPr>
@@ -12182,7 +12182,7 @@
         <w:ind w:left="400" w:hanging="280"/>
       </w:pPr>
       <w:rPr>
-        <w:color w:val="26231E"/>
+        <w:color w:val="38352F"/>
         <w:sz w:val="12"/>
         <w:szCs w:val="12"/>
       </w:rPr>
@@ -12335,7 +12335,7 @@
     <w:rPrDefault>
       <w:rPr>
         <w:rFonts w:ascii="Segoe UI" w:eastAsia="微软雅黑" w:hAnsi="Segoe UI" w:cs="Segoe UI"/>
-        <w:color w:val="26231E"/>
+        <w:color w:val="38352F"/>
         <w:sz w:val="21"/>
         <w:szCs w:val="21"/>
         <w:lang w:val="en-US" w:eastAsia="zh-CN" w:bidi="ar-SA"/>
@@ -12991,7 +12991,7 @@
     <w:next w:val="a"/>
     <w:qFormat/>
     <w:rPr>
-      <w:color w:val="6A6458"/>
+      <w:color w:val="38352F"/>
       <w:sz w:val="19"/>
       <w:szCs w:val="19"/>
     </w:rPr>

</xml_diff>